<commit_message>
finished Brick Breaker course
</commit_message>
<xml_diff>
--- a/NEW Course - Pygame Zero Games/Space Shooters/Challenge Doc Hints.docx
+++ b/NEW Course - Pygame Zero Games/Space Shooters/Challenge Doc Hints.docx
@@ -17,7 +17,21 @@
         <w:rPr>
           <w:lang w:val="en-US"/>
         </w:rPr>
-        <w:t>Instead of dying immediately, give the player a certain number of lives.</w:t>
+        <w:t xml:space="preserve">Instead of dying immediately, </w:t>
+      </w:r>
+      <w:proofErr w:type="gramStart"/>
+      <w:r>
+        <w:rPr>
+          <w:lang w:val="en-US"/>
+        </w:rPr>
+        <w:t>give</w:t>
+      </w:r>
+      <w:proofErr w:type="gramEnd"/>
+      <w:r>
+        <w:rPr>
+          <w:lang w:val="en-US"/>
+        </w:rPr>
+        <w:t xml:space="preserve"> the player a certain number of lives.</w:t>
       </w:r>
     </w:p>
     <w:p>
@@ -120,7 +134,21 @@
         <w:rPr>
           <w:lang w:val="en-US"/>
         </w:rPr>
-        <w:t xml:space="preserve"> the first time they get hit?</w:t>
+        <w:t xml:space="preserve"> the first </w:t>
+      </w:r>
+      <w:proofErr w:type="gramStart"/>
+      <w:r>
+        <w:rPr>
+          <w:lang w:val="en-US"/>
+        </w:rPr>
+        <w:t>time</w:t>
+      </w:r>
+      <w:proofErr w:type="gramEnd"/>
+      <w:r>
+        <w:rPr>
+          <w:lang w:val="en-US"/>
+        </w:rPr>
+        <w:t xml:space="preserve"> they get hit?</w:t>
       </w:r>
     </w:p>
     <w:p>
@@ -256,14 +284,55 @@
         <w:rPr>
           <w:lang w:val="en-US"/>
         </w:rPr>
-        <w:t xml:space="preserve">You can put all of the names of the images that you want to use for the enemies in a list, then use the </w:t>
-      </w:r>
+        <w:t xml:space="preserve">You can put </w:t>
+      </w:r>
+      <w:proofErr w:type="gramStart"/>
+      <w:r>
+        <w:rPr>
+          <w:lang w:val="en-US"/>
+        </w:rPr>
+        <w:t>all of</w:t>
+      </w:r>
+      <w:proofErr w:type="gramEnd"/>
+      <w:r>
+        <w:rPr>
+          <w:lang w:val="en-US"/>
+        </w:rPr>
+        <w:t xml:space="preserve"> the names of the images that you want to use for the enemies in a list, then use the </w:t>
+      </w:r>
+      <w:proofErr w:type="spellStart"/>
+      <w:proofErr w:type="gramStart"/>
       <w:r>
         <w:rPr>
           <w:rFonts w:ascii="Consolas" w:hAnsi="Consolas"/>
           <w:lang w:val="en-US"/>
         </w:rPr>
-        <w:t>random.choice(your_list_name)</w:t>
+        <w:t>random.choice</w:t>
+      </w:r>
+      <w:proofErr w:type="spellEnd"/>
+      <w:proofErr w:type="gramEnd"/>
+      <w:r>
+        <w:rPr>
+          <w:rFonts w:ascii="Consolas" w:hAnsi="Consolas"/>
+          <w:lang w:val="en-US"/>
+        </w:rPr>
+        <w:t>(</w:t>
+      </w:r>
+      <w:proofErr w:type="spellStart"/>
+      <w:r>
+        <w:rPr>
+          <w:rFonts w:ascii="Consolas" w:hAnsi="Consolas"/>
+          <w:lang w:val="en-US"/>
+        </w:rPr>
+        <w:t>your_list_name</w:t>
+      </w:r>
+      <w:proofErr w:type="spellEnd"/>
+      <w:r>
+        <w:rPr>
+          <w:rFonts w:ascii="Consolas" w:hAnsi="Consolas"/>
+          <w:lang w:val="en-US"/>
+        </w:rPr>
+        <w:t>)</w:t>
       </w:r>
       <w:r>
         <w:rPr>
@@ -342,7 +411,21 @@
         <w:rPr>
           <w:lang w:val="en-US"/>
         </w:rPr>
-        <w:t>Include meteors in your game. You will not be able to shoot these meteors and they will instantly end your game if they hit you.</w:t>
+        <w:t xml:space="preserve">Include meteors in your game. You will not be able to shoot these </w:t>
+      </w:r>
+      <w:proofErr w:type="gramStart"/>
+      <w:r>
+        <w:rPr>
+          <w:lang w:val="en-US"/>
+        </w:rPr>
+        <w:t>meteors</w:t>
+      </w:r>
+      <w:proofErr w:type="gramEnd"/>
+      <w:r>
+        <w:rPr>
+          <w:lang w:val="en-US"/>
+        </w:rPr>
+        <w:t xml:space="preserve"> and they will instantly end your game if they hit you.</w:t>
       </w:r>
     </w:p>
     <w:p>
@@ -448,15 +531,26 @@
           <w:rFonts w:ascii="Consolas" w:hAnsi="Consolas"/>
           <w:lang w:val="en-US"/>
         </w:rPr>
-        <w:t>if enemy</w:t>
-      </w:r>
+        <w:t xml:space="preserve">if </w:t>
+      </w:r>
+      <w:proofErr w:type="spellStart"/>
+      <w:proofErr w:type="gramStart"/>
       <w:r>
         <w:rPr>
           <w:rFonts w:ascii="Consolas" w:hAnsi="Consolas"/>
           <w:lang w:val="en-US"/>
         </w:rPr>
+        <w:t>enemy</w:t>
+      </w:r>
+      <w:r>
+        <w:rPr>
+          <w:rFonts w:ascii="Consolas" w:hAnsi="Consolas"/>
+          <w:lang w:val="en-US"/>
+        </w:rPr>
         <w:t>.image</w:t>
       </w:r>
+      <w:proofErr w:type="spellEnd"/>
+      <w:proofErr w:type="gramEnd"/>
       <w:r>
         <w:rPr>
           <w:rFonts w:ascii="Consolas" w:hAnsi="Consolas"/>
@@ -476,7 +570,23 @@
           <w:rFonts w:ascii="Consolas" w:hAnsi="Consolas"/>
           <w:lang w:val="en-US"/>
         </w:rPr>
-        <w:t>= “meteor_image_file_name”:</w:t>
+        <w:t>= “</w:t>
+      </w:r>
+      <w:proofErr w:type="spellStart"/>
+      <w:r>
+        <w:rPr>
+          <w:rFonts w:ascii="Consolas" w:hAnsi="Consolas"/>
+          <w:lang w:val="en-US"/>
+        </w:rPr>
+        <w:t>meteor_image_file_name</w:t>
+      </w:r>
+      <w:proofErr w:type="spellEnd"/>
+      <w:r>
+        <w:rPr>
+          <w:rFonts w:ascii="Consolas" w:hAnsi="Consolas"/>
+          <w:lang w:val="en-US"/>
+        </w:rPr>
+        <w:t>”:</w:t>
       </w:r>
     </w:p>
     <w:p>
@@ -574,7 +684,21 @@
         <w:rPr>
           <w:lang w:val="en-US"/>
         </w:rPr>
-        <w:t>Give different enemies different types/colours of bullets. You could even make these bullets have a different speed!</w:t>
+        <w:t>Give different enemies different types/</w:t>
+      </w:r>
+      <w:proofErr w:type="spellStart"/>
+      <w:r>
+        <w:rPr>
+          <w:lang w:val="en-US"/>
+        </w:rPr>
+        <w:t>colours</w:t>
+      </w:r>
+      <w:proofErr w:type="spellEnd"/>
+      <w:r>
+        <w:rPr>
+          <w:lang w:val="en-US"/>
+        </w:rPr>
+        <w:t xml:space="preserve"> of bullets. You could even make these bullets have a different speed!</w:t>
       </w:r>
     </w:p>
     <w:p>
@@ -623,7 +747,21 @@
         <w:rPr>
           <w:lang w:val="en-US"/>
         </w:rPr>
-        <w:t>Copy and paste the section of that creates the new enemy bullets into the other section of the if-else statement. If the enemy’s image matches the one you selected, select a different image for the enemy’s bullet</w:t>
+        <w:t xml:space="preserve">Copy and paste the </w:t>
+      </w:r>
+      <w:proofErr w:type="gramStart"/>
+      <w:r>
+        <w:rPr>
+          <w:lang w:val="en-US"/>
+        </w:rPr>
+        <w:t>section of</w:t>
+      </w:r>
+      <w:proofErr w:type="gramEnd"/>
+      <w:r>
+        <w:rPr>
+          <w:lang w:val="en-US"/>
+        </w:rPr>
+        <w:t xml:space="preserve"> that creates the new enemy bullets into the other section of the if-else statement. If the enemy’s image matches the one you selected, select a different image for the enemy’s bullet</w:t>
       </w:r>
     </w:p>
     <w:p>
@@ -641,7 +779,21 @@
         <w:rPr>
           <w:lang w:val="en-US"/>
         </w:rPr>
-        <w:t>In the section of code that moves the enemies’ bullets, if the bullet you’re moving matches the “special bullet’s” image, then move it at a different speed</w:t>
+        <w:t xml:space="preserve">In the section of code that moves the enemies’ bullets, if the </w:t>
+      </w:r>
+      <w:proofErr w:type="gramStart"/>
+      <w:r>
+        <w:rPr>
+          <w:lang w:val="en-US"/>
+        </w:rPr>
+        <w:t>bullet</w:t>
+      </w:r>
+      <w:proofErr w:type="gramEnd"/>
+      <w:r>
+        <w:rPr>
+          <w:lang w:val="en-US"/>
+        </w:rPr>
+        <w:t xml:space="preserve"> you’re moving matches the “special bullet’s” image, then move it at a different speed</w:t>
       </w:r>
     </w:p>
     <w:p>
@@ -667,7 +819,21 @@
         <w:rPr>
           <w:lang w:val="en-US"/>
         </w:rPr>
-        <w:t xml:space="preserve"> on one of these suggestions or how to try to do your own idea</w:t>
+        <w:t xml:space="preserve"> </w:t>
+      </w:r>
+      <w:proofErr w:type="gramStart"/>
+      <w:r>
+        <w:rPr>
+          <w:lang w:val="en-US"/>
+        </w:rPr>
+        <w:t>on</w:t>
+      </w:r>
+      <w:proofErr w:type="gramEnd"/>
+      <w:r>
+        <w:rPr>
+          <w:lang w:val="en-US"/>
+        </w:rPr>
+        <w:t xml:space="preserve"> one of these suggestions or how to try to do your own idea</w:t>
       </w:r>
       <w:r>
         <w:rPr>

</xml_diff>